<commit_message>
Add Windows installer and Windows section to the guide; strip CR from jq output
Co-Authored-By: Claude Opus 5.5 <noreply@anthropic.com>
Claude-Session: https://claude.ai/code/session_012UCX6D43wKLb1nTBJW5QMa
</commit_message>
<xml_diff>
--- a/skillspector-guard/Guia-SkillSpector-Guard.docx
+++ b/skillspector-guard/Guia-SkillSpector-Guard.docx
@@ -995,7 +995,230 @@
           <w:sz w:val="32"/>
           <w:szCs w:val="32"/>
         </w:rPr>
-        <w:t xml:space="preserve">3. Requisitos</w:t>
+        <w:t xml:space="preserve">3. Si usas Windows: empieza aquí</w:t>
+      </w:r>
+    </w:p>
+    <w:p>
+      <w:pPr>
+        <w:spacing w:after="120" w:line="276"/>
+      </w:pPr>
+      <w:r>
+        <w:rPr>
+          <w:rFonts w:ascii="Calibri" w:cs="Calibri" w:eastAsia="Calibri" w:hAnsi="Calibri"/>
+          <w:sz w:val="22"/>
+          <w:szCs w:val="22"/>
+        </w:rPr>
+        <w:t xml:space="preserve">En Windows </w:t>
+      </w:r>
+      <w:r>
+        <w:rPr>
+          <w:rFonts w:ascii="Calibri" w:cs="Calibri" w:eastAsia="Calibri" w:hAnsi="Calibri"/>
+          <w:b/>
+          <w:bCs/>
+          <w:sz w:val="22"/>
+          <w:szCs w:val="22"/>
+        </w:rPr>
+        <w:t xml:space="preserve">no necesitas las secciones 4, 5 y 6</w:t>
+      </w:r>
+      <w:r>
+        <w:rPr>
+          <w:rFonts w:ascii="Calibri" w:cs="Calibri" w:eastAsia="Calibri" w:hAnsi="Calibri"/>
+          <w:sz w:val="22"/>
+          <w:szCs w:val="22"/>
+        </w:rPr>
+        <w:t xml:space="preserve"> (son para macOS y Linux). Usa </w:t>
+      </w:r>
+      <w:r>
+        <w:rPr>
+          <w:rFonts w:ascii="Calibri" w:cs="Calibri" w:eastAsia="Calibri" w:hAnsi="Calibri"/>
+          <w:b/>
+          <w:bCs/>
+          <w:sz w:val="22"/>
+          <w:szCs w:val="22"/>
+        </w:rPr>
+        <w:t xml:space="preserve">PowerShell</w:t>
+      </w:r>
+      <w:r>
+        <w:rPr>
+          <w:rFonts w:ascii="Calibri" w:cs="Calibri" w:eastAsia="Calibri" w:hAnsi="Calibri"/>
+          <w:sz w:val="22"/>
+          <w:szCs w:val="22"/>
+        </w:rPr>
+        <w:t xml:space="preserve">, no cmd: busca "PowerShell" en el menú Inicio y ábrelo (no hace falta como administrador). Pega estos comandos uno por uno y presiona Enter después de cada uno.</w:t>
+      </w:r>
+    </w:p>
+    <w:p>
+      <w:pPr>
+        <w:pStyle w:val="ListParagraph"/>
+        <w:numPr>
+          <w:ilvl w:val="0"/>
+          <w:numId w:val="3"/>
+        </w:numPr>
+        <w:spacing w:after="80" w:before="160"/>
+      </w:pPr>
+      <w:r>
+        <w:rPr>
+          <w:rFonts w:ascii="Calibri" w:cs="Calibri" w:eastAsia="Calibri" w:hAnsi="Calibri"/>
+          <w:b/>
+          <w:bCs/>
+          <w:sz w:val="22"/>
+          <w:szCs w:val="22"/>
+        </w:rPr>
+        <w:t xml:space="preserve">Instala Git (si ya lo tienes, este paso no hace nada)</w:t>
+      </w:r>
+    </w:p>
+    <w:p>
+      <w:pPr>
+        <w:pBdr>
+          <w:top w:val="single" w:color="E5E7EB" w:sz="4" w:space="4"/>
+        </w:pBdr>
+        <w:shd w:fill="F3F4F6" w:color="auto" w:val="clear"/>
+        <w:spacing w:after="140" w:before="60"/>
+        <w:ind w:left="200" w:right="200"/>
+      </w:pPr>
+      <w:r>
+        <w:rPr>
+          <w:rFonts w:ascii="Consolas" w:cs="Consolas" w:eastAsia="Consolas" w:hAnsi="Consolas"/>
+          <w:color w:val="374151"/>
+          <w:sz w:val="19"/>
+          <w:szCs w:val="19"/>
+        </w:rPr>
+        <w:t xml:space="preserve">winget install --id Git.Git -e</w:t>
+      </w:r>
+    </w:p>
+    <w:p>
+      <w:pPr>
+        <w:spacing w:after="120" w:line="276"/>
+      </w:pPr>
+      <w:r>
+        <w:rPr>
+          <w:rFonts w:ascii="Calibri" w:cs="Calibri" w:eastAsia="Calibri" w:hAnsi="Calibri"/>
+          <w:sz w:val="22"/>
+          <w:szCs w:val="22"/>
+        </w:rPr>
+        <w:t xml:space="preserve">Cuando termine, </w:t>
+      </w:r>
+      <w:r>
+        <w:rPr>
+          <w:rFonts w:ascii="Calibri" w:cs="Calibri" w:eastAsia="Calibri" w:hAnsi="Calibri"/>
+          <w:b/>
+          <w:bCs/>
+          <w:sz w:val="22"/>
+          <w:szCs w:val="22"/>
+        </w:rPr>
+        <w:t xml:space="preserve">cierra PowerShell y ábrelo de nuevo</w:t>
+      </w:r>
+      <w:r>
+        <w:rPr>
+          <w:rFonts w:ascii="Calibri" w:cs="Calibri" w:eastAsia="Calibri" w:hAnsi="Calibri"/>
+          <w:sz w:val="22"/>
+          <w:szCs w:val="22"/>
+        </w:rPr>
+        <w:t xml:space="preserve"> para que reconozca git.</w:t>
+      </w:r>
+    </w:p>
+    <w:p>
+      <w:pPr>
+        <w:pStyle w:val="ListParagraph"/>
+        <w:numPr>
+          <w:ilvl w:val="0"/>
+          <w:numId w:val="3"/>
+        </w:numPr>
+        <w:spacing w:after="80" w:before="160"/>
+      </w:pPr>
+      <w:r>
+        <w:rPr>
+          <w:rFonts w:ascii="Calibri" w:cs="Calibri" w:eastAsia="Calibri" w:hAnsi="Calibri"/>
+          <w:b/>
+          <w:bCs/>
+          <w:sz w:val="22"/>
+          <w:szCs w:val="22"/>
+        </w:rPr>
+        <w:t xml:space="preserve">Descarga el guardia desde tu repo</w:t>
+      </w:r>
+    </w:p>
+    <w:p>
+      <w:pPr>
+        <w:pBdr>
+          <w:top w:val="single" w:color="E5E7EB" w:sz="4" w:space="4"/>
+        </w:pBdr>
+        <w:shd w:fill="F3F4F6" w:color="auto" w:val="clear"/>
+        <w:spacing w:after="140" w:before="60"/>
+        <w:ind w:left="200" w:right="200"/>
+      </w:pPr>
+      <w:r>
+        <w:rPr>
+          <w:rFonts w:ascii="Consolas" w:cs="Consolas" w:eastAsia="Consolas" w:hAnsi="Consolas"/>
+          <w:color w:val="374151"/>
+          <w:sz w:val="19"/>
+          <w:szCs w:val="19"/>
+        </w:rPr>
+        <w:t xml:space="preserve">git clone -c core.autocrlf=false -b claude/skillspector-repo-guard-1sa649 https://github.com/ralex5/alex.git $HOME\skillspector-guard-src</w:t>
+      </w:r>
+    </w:p>
+    <w:p>
+      <w:pPr>
+        <w:spacing w:after="120" w:line="276"/>
+      </w:pPr>
+      <w:r>
+        <w:rPr>
+          <w:rFonts w:ascii="Calibri" w:cs="Calibri" w:eastAsia="Calibri" w:hAnsi="Calibri"/>
+          <w:sz w:val="22"/>
+          <w:szCs w:val="22"/>
+        </w:rPr>
+        <w:t xml:space="preserve">Si te pide iniciar sesión en GitHub, acepta: el repo es tuyo y es privado.</w:t>
+      </w:r>
+    </w:p>
+    <w:p>
+      <w:pPr>
+        <w:pStyle w:val="ListParagraph"/>
+        <w:numPr>
+          <w:ilvl w:val="0"/>
+          <w:numId w:val="3"/>
+        </w:numPr>
+        <w:spacing w:after="80" w:before="160"/>
+      </w:pPr>
+      <w:r>
+        <w:rPr>
+          <w:rFonts w:ascii="Calibri" w:cs="Calibri" w:eastAsia="Calibri" w:hAnsi="Calibri"/>
+          <w:b/>
+          <w:bCs/>
+          <w:sz w:val="22"/>
+          <w:szCs w:val="22"/>
+        </w:rPr>
+        <w:t xml:space="preserve">Ejecuta el instalador</w:t>
+      </w:r>
+    </w:p>
+    <w:p>
+      <w:pPr>
+        <w:pBdr>
+          <w:top w:val="single" w:color="E5E7EB" w:sz="4" w:space="4"/>
+        </w:pBdr>
+        <w:shd w:fill="F3F4F6" w:color="auto" w:val="clear"/>
+        <w:spacing w:after="140" w:before="60"/>
+        <w:ind w:left="200" w:right="200"/>
+      </w:pPr>
+      <w:r>
+        <w:rPr>
+          <w:rFonts w:ascii="Consolas" w:cs="Consolas" w:eastAsia="Consolas" w:hAnsi="Consolas"/>
+          <w:color w:val="374151"/>
+          <w:sz w:val="19"/>
+          <w:szCs w:val="19"/>
+        </w:rPr>
+        <w:t xml:space="preserve">powershell -ExecutionPolicy Bypass -File $HOME\skillspector-guard-src\skillspector-guard\install-windows.ps1</w:t>
+      </w:r>
+    </w:p>
+    <w:p>
+      <w:pPr>
+        <w:spacing w:after="120" w:line="276"/>
+      </w:pPr>
+      <w:r>
+        <w:rPr>
+          <w:rFonts w:ascii="Calibri" w:cs="Calibri" w:eastAsia="Calibri" w:hAnsi="Calibri"/>
+          <w:sz w:val="22"/>
+          <w:szCs w:val="22"/>
+        </w:rPr>
+        <w:t xml:space="preserve">El instalador hace todo solo:</w:t>
       </w:r>
     </w:p>
     <w:p>
@@ -1010,20 +1233,10 @@
       <w:r>
         <w:rPr>
           <w:rFonts w:ascii="Calibri" w:cs="Calibri" w:eastAsia="Calibri" w:hAnsi="Calibri"/>
-          <w:b/>
-          <w:bCs/>
-          <w:sz w:val="22"/>
-          <w:szCs w:val="22"/>
-        </w:rPr>
-        <w:t xml:space="preserve">macOS o Linux. </w:t>
-      </w:r>
-      <w:r>
-        <w:rPr>
-          <w:rFonts w:ascii="Calibri" w:cs="Calibri" w:eastAsia="Calibri" w:hAnsi="Calibri"/>
-          <w:sz w:val="22"/>
-          <w:szCs w:val="22"/>
-        </w:rPr>
-        <w:t xml:space="preserve">En Windows, usa WSL (Ubuntu) y haz todo dentro de WSL.</w:t>
+          <w:sz w:val="22"/>
+          <w:szCs w:val="22"/>
+        </w:rPr>
+        <w:t xml:space="preserve">Instala jq, uv y SkillSpector, y comprueba que SkillSpector responde.</w:t>
       </w:r>
     </w:p>
     <w:p>
@@ -1038,20 +1251,27 @@
       <w:r>
         <w:rPr>
           <w:rFonts w:ascii="Calibri" w:cs="Calibri" w:eastAsia="Calibri" w:hAnsi="Calibri"/>
-          <w:b/>
-          <w:bCs/>
-          <w:sz w:val="22"/>
-          <w:szCs w:val="22"/>
-        </w:rPr>
-        <w:t xml:space="preserve">git, jq, uv. </w:t>
-      </w:r>
-      <w:r>
-        <w:rPr>
-          <w:rFonts w:ascii="Calibri" w:cs="Calibri" w:eastAsia="Calibri" w:hAnsi="Calibri"/>
-          <w:sz w:val="22"/>
-          <w:szCs w:val="22"/>
-        </w:rPr>
-        <w:t xml:space="preserve">Los pasos de abajo instalan lo que falte.</w:t>
+          <w:sz w:val="22"/>
+          <w:szCs w:val="22"/>
+        </w:rPr>
+        <w:t xml:space="preserve">Copia el guardia a </w:t>
+      </w:r>
+      <w:r>
+        <w:rPr>
+          <w:rFonts w:ascii="Consolas" w:cs="Consolas" w:eastAsia="Consolas" w:hAnsi="Consolas"/>
+          <w:color w:val="374151"/>
+          <w:sz w:val="19"/>
+          <w:szCs w:val="19"/>
+        </w:rPr>
+        <w:t xml:space="preserve">%USERPROFILE%\.claude\hooks\</w:t>
+      </w:r>
+      <w:r>
+        <w:rPr>
+          <w:rFonts w:ascii="Calibri" w:cs="Calibri" w:eastAsia="Calibri" w:hAnsi="Calibri"/>
+          <w:sz w:val="22"/>
+          <w:szCs w:val="22"/>
+        </w:rPr>
+        <w:t xml:space="preserve">.</w:t>
       </w:r>
     </w:p>
     <w:p>
@@ -1066,53 +1286,90 @@
       <w:r>
         <w:rPr>
           <w:rFonts w:ascii="Calibri" w:cs="Calibri" w:eastAsia="Calibri" w:hAnsi="Calibri"/>
-          <w:b/>
-          <w:bCs/>
-          <w:sz w:val="22"/>
-          <w:szCs w:val="22"/>
-        </w:rPr>
-        <w:t xml:space="preserve">Claude Code </w:t>
-      </w:r>
-      <w:r>
-        <w:rPr>
-          <w:rFonts w:ascii="Calibri" w:cs="Calibri" w:eastAsia="Calibri" w:hAnsi="Calibri"/>
-          <w:sz w:val="22"/>
-          <w:szCs w:val="22"/>
-        </w:rPr>
-        <w:t xml:space="preserve">(y Codex, si lo usas) ya instalados.</w:t>
-      </w:r>
-    </w:p>
-    <w:p>
-      <w:pPr>
-        <w:pStyle w:val="Heading1"/>
-        <w:pBdr>
-          <w:bottom w:val="single" w:color="76B900" w:sz="8" w:space="4"/>
-        </w:pBdr>
-        <w:spacing w:after="160" w:before="360"/>
-      </w:pPr>
-      <w:r>
-        <w:rPr>
-          <w:rFonts w:ascii="Calibri" w:cs="Calibri" w:eastAsia="Calibri" w:hAnsi="Calibri"/>
-          <w:b/>
-          <w:bCs/>
-          <w:color w:val="1F2937"/>
-          <w:sz w:val="32"/>
-          <w:szCs w:val="32"/>
-        </w:rPr>
-        <w:t xml:space="preserve">4. Instalación en tu computadora</w:t>
-      </w:r>
-    </w:p>
-    <w:p>
-      <w:pPr>
-        <w:spacing w:after="120" w:line="276"/>
-      </w:pPr>
-      <w:r>
-        <w:rPr>
-          <w:rFonts w:ascii="Calibri" w:cs="Calibri" w:eastAsia="Calibri" w:hAnsi="Calibri"/>
-          <w:sz w:val="22"/>
-          <w:szCs w:val="22"/>
-        </w:rPr>
-        <w:t xml:space="preserve">Abre una terminal normal (no dentro de Claude Code) y sigue estos pasos.</w:t>
+          <w:sz w:val="22"/>
+          <w:szCs w:val="22"/>
+        </w:rPr>
+        <w:t xml:space="preserve">Lo registra en </w:t>
+      </w:r>
+      <w:r>
+        <w:rPr>
+          <w:rFonts w:ascii="Consolas" w:cs="Consolas" w:eastAsia="Consolas" w:hAnsi="Consolas"/>
+          <w:color w:val="374151"/>
+          <w:sz w:val="19"/>
+          <w:szCs w:val="19"/>
+        </w:rPr>
+        <w:t xml:space="preserve">.claude\settings.json</w:t>
+      </w:r>
+      <w:r>
+        <w:rPr>
+          <w:rFonts w:ascii="Calibri" w:cs="Calibri" w:eastAsia="Calibri" w:hAnsi="Calibri"/>
+          <w:sz w:val="22"/>
+          <w:szCs w:val="22"/>
+        </w:rPr>
+        <w:t xml:space="preserve">, conservando tus hooks y guardando una copia </w:t>
+      </w:r>
+      <w:r>
+        <w:rPr>
+          <w:rFonts w:ascii="Consolas" w:cs="Consolas" w:eastAsia="Consolas" w:hAnsi="Consolas"/>
+          <w:color w:val="374151"/>
+          <w:sz w:val="19"/>
+          <w:szCs w:val="19"/>
+        </w:rPr>
+        <w:t xml:space="preserve">.bak</w:t>
+      </w:r>
+      <w:r>
+        <w:rPr>
+          <w:rFonts w:ascii="Calibri" w:cs="Calibri" w:eastAsia="Calibri" w:hAnsi="Calibri"/>
+          <w:sz w:val="22"/>
+          <w:szCs w:val="22"/>
+        </w:rPr>
+        <w:t xml:space="preserve">.</w:t>
+      </w:r>
+    </w:p>
+    <w:p>
+      <w:pPr>
+        <w:pStyle w:val="ListParagraph"/>
+        <w:numPr>
+          <w:ilvl w:val="0"/>
+          <w:numId w:val="2"/>
+        </w:numPr>
+        <w:spacing w:after="80"/>
+      </w:pPr>
+      <w:r>
+        <w:rPr>
+          <w:rFonts w:ascii="Calibri" w:cs="Calibri" w:eastAsia="Calibri" w:hAnsi="Calibri"/>
+          <w:b/>
+          <w:bCs/>
+          <w:sz w:val="22"/>
+          <w:szCs w:val="22"/>
+        </w:rPr>
+        <w:t xml:space="preserve">Codex: </w:t>
+      </w:r>
+      <w:r>
+        <w:rPr>
+          <w:rFonts w:ascii="Calibri" w:cs="Calibri" w:eastAsia="Calibri" w:hAnsi="Calibri"/>
+          <w:sz w:val="22"/>
+          <w:szCs w:val="22"/>
+        </w:rPr>
+        <w:t xml:space="preserve">si tienes Codex instalado, también lo configura. Si no lo usas, lo omite: no tienes que hacer nada.</w:t>
+      </w:r>
+    </w:p>
+    <w:p>
+      <w:pPr>
+        <w:pStyle w:val="ListParagraph"/>
+        <w:numPr>
+          <w:ilvl w:val="0"/>
+          <w:numId w:val="2"/>
+        </w:numPr>
+        <w:spacing w:after="80"/>
+      </w:pPr>
+      <w:r>
+        <w:rPr>
+          <w:rFonts w:ascii="Calibri" w:cs="Calibri" w:eastAsia="Calibri" w:hAnsi="Calibri"/>
+          <w:sz w:val="22"/>
+          <w:szCs w:val="22"/>
+        </w:rPr>
+        <w:t xml:space="preserve">Termina con dos pruebas rápidas. La segunda debe mostrar el aviso "NO SE REVISÓ".</w:t>
       </w:r>
     </w:p>
     <w:p>
@@ -1132,6 +1389,257 @@
           <w:sz w:val="22"/>
           <w:szCs w:val="22"/>
         </w:rPr>
+        <w:t xml:space="preserve">Reinicia y verifica</w:t>
+      </w:r>
+    </w:p>
+    <w:p>
+      <w:pPr>
+        <w:spacing w:after="120" w:line="276"/>
+      </w:pPr>
+      <w:r>
+        <w:rPr>
+          <w:rFonts w:ascii="Calibri" w:cs="Calibri" w:eastAsia="Calibri" w:hAnsi="Calibri"/>
+          <w:sz w:val="22"/>
+          <w:szCs w:val="22"/>
+        </w:rPr>
+        <w:t xml:space="preserve">Cierra y abre Claude Code y escribe </w:t>
+      </w:r>
+      <w:r>
+        <w:rPr>
+          <w:rFonts w:ascii="Consolas" w:cs="Consolas" w:eastAsia="Consolas" w:hAnsi="Consolas"/>
+          <w:color w:val="374151"/>
+          <w:sz w:val="19"/>
+          <w:szCs w:val="19"/>
+        </w:rPr>
+        <w:t xml:space="preserve">/hooks</w:t>
+      </w:r>
+      <w:r>
+        <w:rPr>
+          <w:rFonts w:ascii="Calibri" w:cs="Calibri" w:eastAsia="Calibri" w:hAnsi="Calibri"/>
+          <w:sz w:val="22"/>
+          <w:szCs w:val="22"/>
+        </w:rPr>
+        <w:t xml:space="preserve">: debe aparecer </w:t>
+      </w:r>
+      <w:r>
+        <w:rPr>
+          <w:rFonts w:ascii="Calibri" w:cs="Calibri" w:eastAsia="Calibri" w:hAnsi="Calibri"/>
+          <w:b/>
+          <w:bCs/>
+          <w:sz w:val="22"/>
+          <w:szCs w:val="22"/>
+        </w:rPr>
+        <w:t xml:space="preserve">PreToolUse → Bash</w:t>
+      </w:r>
+      <w:r>
+        <w:rPr>
+          <w:rFonts w:ascii="Calibri" w:cs="Calibri" w:eastAsia="Calibri" w:hAnsi="Calibri"/>
+          <w:sz w:val="22"/>
+          <w:szCs w:val="22"/>
+        </w:rPr>
+        <w:t xml:space="preserve">. Si usas Codex, ábrelo, escribe </w:t>
+      </w:r>
+      <w:r>
+        <w:rPr>
+          <w:rFonts w:ascii="Consolas" w:cs="Consolas" w:eastAsia="Consolas" w:hAnsi="Consolas"/>
+          <w:color w:val="374151"/>
+          <w:sz w:val="19"/>
+          <w:szCs w:val="19"/>
+        </w:rPr>
+        <w:t xml:space="preserve">/hooks</w:t>
+      </w:r>
+      <w:r>
+        <w:rPr>
+          <w:rFonts w:ascii="Calibri" w:cs="Calibri" w:eastAsia="Calibri" w:hAnsi="Calibri"/>
+          <w:sz w:val="22"/>
+          <w:szCs w:val="22"/>
+        </w:rPr>
+        <w:t xml:space="preserve"> y aprueba el hook nuevo. Eso es todo.</w:t>
+      </w:r>
+    </w:p>
+    <w:p>
+      <w:pPr>
+        <w:pBdr>
+          <w:left w:val="single" w:color="D97706" w:sz="24" w:space="8"/>
+        </w:pBdr>
+        <w:shd w:fill="FEF3C7" w:color="auto" w:val="clear"/>
+        <w:spacing w:after="160" w:before="120"/>
+        <w:ind w:left="200"/>
+      </w:pPr>
+      <w:r>
+        <w:rPr>
+          <w:rFonts w:ascii="Calibri" w:cs="Calibri" w:eastAsia="Calibri" w:hAnsi="Calibri"/>
+          <w:b/>
+          <w:bCs/>
+          <w:color w:val="D97706"/>
+          <w:sz w:val="22"/>
+          <w:szCs w:val="22"/>
+        </w:rPr>
+        <w:t xml:space="preserve">Si algo falla: </w:t>
+      </w:r>
+      <w:r>
+        <w:rPr>
+          <w:rFonts w:ascii="Calibri" w:cs="Calibri" w:eastAsia="Calibri" w:hAnsi="Calibri"/>
+          <w:sz w:val="22"/>
+          <w:szCs w:val="22"/>
+        </w:rPr>
+        <w:t xml:space="preserve">copia el texto rojo o amarillo que salga en PowerShell y pégamelo en el chat. El instalador nunca borra tus ajustes: deja una copia .bak antes de tocar cualquier archivo.</w:t>
+      </w:r>
+    </w:p>
+    <w:p>
+      <w:pPr>
+        <w:pStyle w:val="Heading1"/>
+        <w:pBdr>
+          <w:bottom w:val="single" w:color="76B900" w:sz="8" w:space="4"/>
+        </w:pBdr>
+        <w:spacing w:after="160" w:before="360"/>
+      </w:pPr>
+      <w:r>
+        <w:rPr>
+          <w:rFonts w:ascii="Calibri" w:cs="Calibri" w:eastAsia="Calibri" w:hAnsi="Calibri"/>
+          <w:b/>
+          <w:bCs/>
+          <w:color w:val="1F2937"/>
+          <w:sz w:val="32"/>
+          <w:szCs w:val="32"/>
+        </w:rPr>
+        <w:t xml:space="preserve">4. Requisitos (macOS y Linux)</w:t>
+      </w:r>
+    </w:p>
+    <w:p>
+      <w:pPr>
+        <w:pStyle w:val="ListParagraph"/>
+        <w:numPr>
+          <w:ilvl w:val="0"/>
+          <w:numId w:val="2"/>
+        </w:numPr>
+        <w:spacing w:after="80"/>
+      </w:pPr>
+      <w:r>
+        <w:rPr>
+          <w:rFonts w:ascii="Calibri" w:cs="Calibri" w:eastAsia="Calibri" w:hAnsi="Calibri"/>
+          <w:b/>
+          <w:bCs/>
+          <w:sz w:val="22"/>
+          <w:szCs w:val="22"/>
+        </w:rPr>
+        <w:t xml:space="preserve">macOS o Linux. </w:t>
+      </w:r>
+      <w:r>
+        <w:rPr>
+          <w:rFonts w:ascii="Calibri" w:cs="Calibri" w:eastAsia="Calibri" w:hAnsi="Calibri"/>
+          <w:sz w:val="22"/>
+          <w:szCs w:val="22"/>
+        </w:rPr>
+        <w:t xml:space="preserve">En Windows usa la sección 3.</w:t>
+      </w:r>
+    </w:p>
+    <w:p>
+      <w:pPr>
+        <w:pStyle w:val="ListParagraph"/>
+        <w:numPr>
+          <w:ilvl w:val="0"/>
+          <w:numId w:val="2"/>
+        </w:numPr>
+        <w:spacing w:after="80"/>
+      </w:pPr>
+      <w:r>
+        <w:rPr>
+          <w:rFonts w:ascii="Calibri" w:cs="Calibri" w:eastAsia="Calibri" w:hAnsi="Calibri"/>
+          <w:b/>
+          <w:bCs/>
+          <w:sz w:val="22"/>
+          <w:szCs w:val="22"/>
+        </w:rPr>
+        <w:t xml:space="preserve">git, jq, uv. </w:t>
+      </w:r>
+      <w:r>
+        <w:rPr>
+          <w:rFonts w:ascii="Calibri" w:cs="Calibri" w:eastAsia="Calibri" w:hAnsi="Calibri"/>
+          <w:sz w:val="22"/>
+          <w:szCs w:val="22"/>
+        </w:rPr>
+        <w:t xml:space="preserve">Los pasos de abajo instalan lo que falte.</w:t>
+      </w:r>
+    </w:p>
+    <w:p>
+      <w:pPr>
+        <w:pStyle w:val="ListParagraph"/>
+        <w:numPr>
+          <w:ilvl w:val="0"/>
+          <w:numId w:val="2"/>
+        </w:numPr>
+        <w:spacing w:after="80"/>
+      </w:pPr>
+      <w:r>
+        <w:rPr>
+          <w:rFonts w:ascii="Calibri" w:cs="Calibri" w:eastAsia="Calibri" w:hAnsi="Calibri"/>
+          <w:b/>
+          <w:bCs/>
+          <w:sz w:val="22"/>
+          <w:szCs w:val="22"/>
+        </w:rPr>
+        <w:t xml:space="preserve">Claude Code </w:t>
+      </w:r>
+      <w:r>
+        <w:rPr>
+          <w:rFonts w:ascii="Calibri" w:cs="Calibri" w:eastAsia="Calibri" w:hAnsi="Calibri"/>
+          <w:sz w:val="22"/>
+          <w:szCs w:val="22"/>
+        </w:rPr>
+        <w:t xml:space="preserve">(y Codex, si lo usas) ya instalados.</w:t>
+      </w:r>
+    </w:p>
+    <w:p>
+      <w:pPr>
+        <w:pStyle w:val="Heading1"/>
+        <w:pBdr>
+          <w:bottom w:val="single" w:color="76B900" w:sz="8" w:space="4"/>
+        </w:pBdr>
+        <w:spacing w:after="160" w:before="360"/>
+      </w:pPr>
+      <w:r>
+        <w:rPr>
+          <w:rFonts w:ascii="Calibri" w:cs="Calibri" w:eastAsia="Calibri" w:hAnsi="Calibri"/>
+          <w:b/>
+          <w:bCs/>
+          <w:color w:val="1F2937"/>
+          <w:sz w:val="32"/>
+          <w:szCs w:val="32"/>
+        </w:rPr>
+        <w:t xml:space="preserve">5. Instalación en macOS y Linux</w:t>
+      </w:r>
+    </w:p>
+    <w:p>
+      <w:pPr>
+        <w:spacing w:after="120" w:line="276"/>
+      </w:pPr>
+      <w:r>
+        <w:rPr>
+          <w:rFonts w:ascii="Calibri" w:cs="Calibri" w:eastAsia="Calibri" w:hAnsi="Calibri"/>
+          <w:sz w:val="22"/>
+          <w:szCs w:val="22"/>
+        </w:rPr>
+        <w:t xml:space="preserve">Abre una terminal normal (no dentro de Claude Code) y sigue estos pasos.</w:t>
+      </w:r>
+    </w:p>
+    <w:p>
+      <w:pPr>
+        <w:pStyle w:val="ListParagraph"/>
+        <w:numPr>
+          <w:ilvl w:val="0"/>
+          <w:numId w:val="4"/>
+        </w:numPr>
+        <w:spacing w:after="80" w:before="160"/>
+      </w:pPr>
+      <w:r>
+        <w:rPr>
+          <w:rFonts w:ascii="Calibri" w:cs="Calibri" w:eastAsia="Calibri" w:hAnsi="Calibri"/>
+          <w:b/>
+          <w:bCs/>
+          <w:sz w:val="22"/>
+          <w:szCs w:val="22"/>
+        </w:rPr>
         <w:t xml:space="preserve">Instala jq y uv</w:t>
       </w:r>
     </w:p>
@@ -1239,7 +1747,7 @@
         <w:pStyle w:val="ListParagraph"/>
         <w:numPr>
           <w:ilvl w:val="0"/>
-          <w:numId w:val="3"/>
+          <w:numId w:val="4"/>
         </w:numPr>
         <w:spacing w:after="80" w:before="160"/>
       </w:pPr>
@@ -1327,7 +1835,7 @@
         <w:pStyle w:val="ListParagraph"/>
         <w:numPr>
           <w:ilvl w:val="0"/>
-          <w:numId w:val="3"/>
+          <w:numId w:val="4"/>
         </w:numPr>
         <w:spacing w:after="80" w:before="160"/>
       </w:pPr>
@@ -1415,7 +1923,7 @@
         <w:pStyle w:val="ListParagraph"/>
         <w:numPr>
           <w:ilvl w:val="0"/>
-          <w:numId w:val="3"/>
+          <w:numId w:val="4"/>
         </w:numPr>
         <w:spacing w:after="80" w:before="160"/>
       </w:pPr>
@@ -1489,7 +1997,7 @@
         <w:pStyle w:val="ListParagraph"/>
         <w:numPr>
           <w:ilvl w:val="0"/>
-          <w:numId w:val="3"/>
+          <w:numId w:val="4"/>
         </w:numPr>
         <w:spacing w:after="80" w:before="160"/>
       </w:pPr>
@@ -1737,7 +2245,7 @@
         <w:pStyle w:val="ListParagraph"/>
         <w:numPr>
           <w:ilvl w:val="0"/>
-          <w:numId w:val="3"/>
+          <w:numId w:val="4"/>
         </w:numPr>
         <w:spacing w:after="80" w:before="160"/>
       </w:pPr>
@@ -1805,7 +2313,7 @@
         <w:pStyle w:val="ListParagraph"/>
         <w:numPr>
           <w:ilvl w:val="0"/>
-          <w:numId w:val="3"/>
+          <w:numId w:val="4"/>
         </w:numPr>
         <w:spacing w:after="80" w:before="160"/>
       </w:pPr>
@@ -1868,7 +2376,7 @@
           <w:sz w:val="22"/>
           <w:szCs w:val="22"/>
         </w:rPr>
-        <w:t xml:space="preserve">La primera vez verás el aviso de "sigue escaneando en segundo plano". Repite el comando en unos 10 minutos y verás la decisión real (sección 7).</w:t>
+        <w:t xml:space="preserve">La primera vez verás el aviso de "sigue escaneando en segundo plano". Repite el comando en unos 10 minutos y verás la decisión real (sección 8).</w:t>
       </w:r>
     </w:p>
     <w:p>
@@ -1888,7 +2396,7 @@
           <w:sz w:val="32"/>
           <w:szCs w:val="32"/>
         </w:rPr>
-        <w:t xml:space="preserve">5. Codex (opcional)</w:t>
+        <w:t xml:space="preserve">6. Codex en macOS y Linux (opcional)</w:t>
       </w:r>
     </w:p>
     <w:p>
@@ -2205,7 +2713,7 @@
           <w:sz w:val="32"/>
           <w:szCs w:val="32"/>
         </w:rPr>
-        <w:t xml:space="preserve">6. Ajustes</w:t>
+        <w:t xml:space="preserve">7. Ajustes</w:t>
       </w:r>
     </w:p>
     <w:p>
@@ -2655,7 +3163,7 @@
           <w:sz w:val="32"/>
           <w:szCs w:val="32"/>
         </w:rPr>
-        <w:t xml:space="preserve">7. Pruebas realizadas</w:t>
+        <w:t xml:space="preserve">8. Pruebas realizadas</w:t>
       </w:r>
     </w:p>
     <w:p>
@@ -3262,7 +3770,7 @@
           <w:sz w:val="32"/>
           <w:szCs w:val="32"/>
         </w:rPr>
-        <w:t xml:space="preserve">8. Limitaciones</w:t>
+        <w:t xml:space="preserve">9. Limitaciones</w:t>
       </w:r>
     </w:p>
     <w:p>
@@ -3422,7 +3930,7 @@
           <w:sz w:val="32"/>
           <w:szCs w:val="32"/>
         </w:rPr>
-        <w:t xml:space="preserve">9. Desinstalar</w:t>
+        <w:t xml:space="preserve">10. Desinstalar</w:t>
       </w:r>
     </w:p>
     <w:p>
@@ -3739,6 +4247,24 @@
       </w:rPr>
     </w:lvl>
   </w:abstractNum>
+  <w:abstractNum w:abstractNumId="4" w15:restartNumberingAfterBreak="0">
+    <w:multiLevelType w:val="hybridMultilevel"/>
+    <w:lvl w:ilvl="0" w15:tentative="1">
+      <w:start w:val="1"/>
+      <w:numFmt w:val="decimal"/>
+      <w:lvlText w:val="Paso %1."/>
+      <w:lvlJc w:val="left"/>
+      <w:pPr>
+        <w:ind w:left="900" w:hanging="900"/>
+      </w:pPr>
+      <w:rPr>
+        <w:rFonts w:ascii="Calibri" w:cs="Calibri" w:eastAsia="Calibri" w:hAnsi="Calibri"/>
+        <w:b/>
+        <w:bCs/>
+        <w:color w:val="76B900"/>
+      </w:rPr>
+    </w:lvl>
+  </w:abstractNum>
   <w:num w:numId="1">
     <w:abstractNumId w:val="1"/>
     <w:lvlOverride w:ilvl="0">
@@ -3753,6 +4279,12 @@
   </w:num>
   <w:num w:numId="3">
     <w:abstractNumId w:val="3"/>
+    <w:lvlOverride w:ilvl="0">
+      <w:startOverride w:val="1"/>
+    </w:lvlOverride>
+  </w:num>
+  <w:num w:numId="4">
+    <w:abstractNumId w:val="4"/>
     <w:lvlOverride w:ilvl="0">
       <w:startOverride w:val="1"/>
     </w:lvlOverride>

</xml_diff>